<commit_message>
Update LR2 reports with clean QEMU board screenshot
</commit_message>
<xml_diff>
--- a/LR2_Myrkin_IO-31.docx
+++ b/LR2_Myrkin_IO-31.docx
@@ -3495,7 +3495,7 @@
       <w:r>
         <w:drawing>
           <wp:inline distT="0" distB="0" distL="0" distR="0">
-            <wp:extent cx="5143500" cy="3190875"/>
+            <wp:extent cx="5143500" cy="3552825"/>
             <wp:effectExtent t="0" r="0" b="0" l="0"/>
             <wp:docPr id="1" name="qemu_board_lr2.jpg" descr="Рис. 1 – Вікно qemu-system-gnuarmeclipse з графічним зображенням плати STM32F4-Discovery після завантаження прошивки лабораторної роботи №2" title="Рис. 1 – Вікно qemu-system-gnuarmeclipse з графічним зображенням плати STM32F4-Discovery після завантаження прошивки лабораторної роботи №2"/>
             <wp:cNvGraphicFramePr>
@@ -3520,7 +3520,7 @@
                   <pic:spPr bwMode="auto">
                     <a:xfrm>
                       <a:off x="0" y="0"/>
-                      <a:ext cx="5143500" cy="3190875"/>
+                      <a:ext cx="5143500" cy="3552825"/>
                     </a:xfrm>
                     <a:prstGeom prst="rect">
                       <a:avLst/>
@@ -4296,7 +4296,7 @@
         </w:rPr>
         <w:t xml:space="preserve">Репозиторій з кодом проекту: </w:t>
       </w:r>
-      <w:hyperlink w:history="1" r:id="rId9wcqkhvfs8q2walrnb75r">
+      <w:hyperlink w:history="1" r:id="rIdreup1_yvivf9wlvmpcc0v">
         <w:r>
           <w:rPr>
             <w:rStyle w:val="Hyperlink"/>
@@ -4321,7 +4321,7 @@
         </w:rPr>
         <w:t xml:space="preserve">Відеозапис виконання роботи: </w:t>
       </w:r>
-      <w:hyperlink w:history="1" r:id="rIdkhihk2jglfygfci9d-7tt">
+      <w:hyperlink w:history="1" r:id="rIdxmktxllpqb4umouyewxrq">
         <w:r>
           <w:rPr>
             <w:rStyle w:val="Hyperlink"/>

</xml_diff>

<commit_message>
Add Google Drive video link to LR2 reports
</commit_message>
<xml_diff>
--- a/LR2_Myrkin_IO-31.docx
+++ b/LR2_Myrkin_IO-31.docx
@@ -4296,7 +4296,7 @@
         </w:rPr>
         <w:t xml:space="preserve">Репозиторій з кодом проекту: </w:t>
       </w:r>
-      <w:hyperlink w:history="1" r:id="rIdreup1_yvivf9wlvmpcc0v">
+      <w:hyperlink w:history="1" r:id="rId5u-7x-h81b7vvsk8kwqpp">
         <w:r>
           <w:rPr>
             <w:rStyle w:val="Hyperlink"/>
@@ -4321,7 +4321,7 @@
         </w:rPr>
         <w:t xml:space="preserve">Відеозапис виконання роботи: </w:t>
       </w:r>
-      <w:hyperlink w:history="1" r:id="rIdxmktxllpqb4umouyewxrq">
+      <w:hyperlink w:history="1" r:id="rIdzzptv4gd1jh0yjt9mvl7c">
         <w:r>
           <w:rPr>
             <w:rStyle w:val="Hyperlink"/>
@@ -4329,7 +4329,7 @@
             <w:sz w:val="28"/>
             <w:szCs w:val="28"/>
           </w:rPr>
-          <w:t xml:space="preserve">https://drive.google.com/file/d/&lt;file-id&gt;/view</w:t>
+          <w:t xml:space="preserve">https://drive.google.com/file/d/1VCdxs894GHJ-dSDjbb4r-4isl6oiqaXL/view?hl=ru</w:t>
         </w:r>
       </w:hyperlink>
     </w:p>

</xml_diff>